<commit_message>
Checkpoint admin langgraph ux baseline
</commit_message>
<xml_diff>
--- a/docs/user-guides/AISCL_学生端操作说明书.docx
+++ b/docs/user-guides/AISCL_学生端操作说明书.docx
@@ -12,7 +12,8 @@
           <w:rFonts w:ascii="微软雅黑" w:hAnsi="微软雅黑" w:eastAsia="微软雅黑"/>
           <w:b/>
           <w:i w:val="0"/>
-          <w:sz w:val="21"/>
+          <w:sz w:val="28"/>
+          <w:szCs w:val="72"/>
         </w:rPr>
         <w:t>AISCL 学生端操作说明书</w:t>
       </w:r>
@@ -42,7 +43,64 @@
           <w:i w:val="0"/>
           <w:sz w:val="21"/>
         </w:rPr>
-        <w:t>学生端用于小组协作学习。进入系统后，学生以“小组项目”为单位开展任务阅读、文档共写、资料整理、论证探究、项目 Wiki 沉淀、群组讨论、AI 导师问答和教师支持求助。</w:t>
+        <w:t>学生端用于小组协作学习。进入系统后，学生以“小组项目”为单位开展任务</w:t>
+      </w:r>
+      <w:r>
+        <w:rPr>
+          <w:rFonts w:hint="eastAsia"/>
+          <w:b w:val="0"/>
+          <w:i w:val="0"/>
+          <w:sz w:val="21"/>
+          <w:lang w:val="en-US" w:eastAsia="zh-CN"/>
+        </w:rPr>
+        <w:t>探究</w:t>
+      </w:r>
+      <w:r>
+        <w:rPr>
+          <w:rFonts w:ascii="微软雅黑" w:hAnsi="微软雅黑" w:eastAsia="微软雅黑"/>
+          <w:b w:val="0"/>
+          <w:i w:val="0"/>
+          <w:sz w:val="21"/>
+        </w:rPr>
+        <w:t>、文档</w:t>
+      </w:r>
+      <w:r>
+        <w:rPr>
+          <w:rFonts w:hint="eastAsia"/>
+          <w:b w:val="0"/>
+          <w:i w:val="0"/>
+          <w:sz w:val="21"/>
+          <w:lang w:val="en-US" w:eastAsia="zh-CN"/>
+        </w:rPr>
+        <w:t>撰写</w:t>
+      </w:r>
+      <w:r>
+        <w:rPr>
+          <w:rFonts w:ascii="微软雅黑" w:hAnsi="微软雅黑" w:eastAsia="微软雅黑"/>
+          <w:b w:val="0"/>
+          <w:i w:val="0"/>
+          <w:sz w:val="21"/>
+        </w:rPr>
+        <w:t>、资料整理、论证探究、项目 Wiki 沉淀、</w:t>
+      </w:r>
+      <w:r>
+        <w:rPr>
+          <w:rFonts w:hint="eastAsia"/>
+          <w:b w:val="0"/>
+          <w:i w:val="0"/>
+          <w:sz w:val="21"/>
+          <w:lang w:val="en-US" w:eastAsia="zh-CN"/>
+        </w:rPr>
+        <w:t>小</w:t>
+      </w:r>
+      <w:r>
+        <w:rPr>
+          <w:rFonts w:ascii="微软雅黑" w:hAnsi="微软雅黑" w:eastAsia="微软雅黑"/>
+          <w:b w:val="0"/>
+          <w:i w:val="0"/>
+          <w:sz w:val="21"/>
+        </w:rPr>
+        <w:t>组讨论、AI 导师问答和教师支持求助。</w:t>
       </w:r>
     </w:p>
     <w:p>
@@ -1050,8 +1108,6 @@
         </w:rPr>
         <w:t>或教师</w:t>
       </w:r>
-      <w:bookmarkStart w:id="0" w:name="_GoBack"/>
-      <w:bookmarkEnd w:id="0"/>
       <w:r>
         <w:rPr>
           <w:rFonts w:ascii="微软雅黑" w:hAnsi="微软雅黑" w:eastAsia="微软雅黑"/>
@@ -3734,6 +3790,8 @@
                 </wp:inline>
               </w:drawing>
             </w:r>
+            <w:bookmarkStart w:id="0" w:name="_GoBack"/>
+            <w:bookmarkEnd w:id="0"/>
             <w:r>
               <w:rPr>
                 <w:rFonts w:ascii="微软雅黑" w:hAnsi="微软雅黑" w:eastAsia="微软雅黑"/>

</xml_diff>